<commit_message>
Refactor SPP document generation for Termin I and II
- Removed the old SPP Termin I input file and replaced it with a new input file for Termin I.
- Introduced new input files for SPP Termin II and updated the corresponding Python scripts to handle the new structure.
- Updated the SPP generation logic to reflect changes in input column names and template placeholders.
- Added new document templates for SPP Termin II for both PML and PPL roles.
- Implemented validation checks to ensure required columns are present in the input data.
- Added regression tests to verify the correct functionality of the new SPP generation process.
</commit_message>
<xml_diff>
--- a/template/02. Template SPP PML.docx
+++ b/template/02. Template SPP PML.docx
@@ -107,9 +107,8 @@
           <w:sz w:val="24"/>
           <w:szCs w:val="24"/>
         </w:rPr>
-        <w:t>{{</w:t>
-      </w:r>
-      <w:proofErr w:type="spellStart"/>
+        <w:t>{{no_urut_spp</w:t>
+      </w:r>
       <w:r>
         <w:rPr>
           <w:rFonts w:ascii="Bookman Old Style" w:eastAsia="Bookman Old Style" w:hAnsi="Bookman Old Style" w:cs="Bookman Old Style"/>
@@ -117,9 +116,8 @@
           <w:sz w:val="24"/>
           <w:szCs w:val="24"/>
         </w:rPr>
-        <w:t>no_urut_spp</w:t>
-      </w:r>
-      <w:proofErr w:type="spellEnd"/>
+        <w:t>_t1</w:t>
+      </w:r>
       <w:r>
         <w:rPr>
           <w:rFonts w:ascii="Bookman Old Style" w:eastAsia="Bookman Old Style" w:hAnsi="Bookman Old Style" w:cs="Bookman Old Style"/>
@@ -2998,9 +2996,8 @@
           <w:sz w:val="24"/>
           <w:szCs w:val="24"/>
         </w:rPr>
-        <w:t>{{</w:t>
-      </w:r>
-      <w:proofErr w:type="spellStart"/>
+        <w:t>{{no_urut_spp</w:t>
+      </w:r>
       <w:r>
         <w:rPr>
           <w:rFonts w:ascii="Bookman Old Style" w:eastAsia="Bookman Old Style" w:hAnsi="Bookman Old Style" w:cs="Bookman Old Style"/>
@@ -3008,9 +3005,8 @@
           <w:sz w:val="24"/>
           <w:szCs w:val="24"/>
         </w:rPr>
-        <w:t>no_urut_spp</w:t>
-      </w:r>
-      <w:proofErr w:type="spellEnd"/>
+        <w:t>_t1</w:t>
+      </w:r>
       <w:r>
         <w:rPr>
           <w:rFonts w:ascii="Bookman Old Style" w:eastAsia="Bookman Old Style" w:hAnsi="Bookman Old Style" w:cs="Bookman Old Style"/>

</xml_diff>